<commit_message>
Add Revision 1 main-text tables (docx and PDF)
</commit_message>
<xml_diff>
--- a/outputs/tables/asb_framework_tables.docx
+++ b/outputs/tables/asb_framework_tables.docx
@@ -1,6 +1,6 @@
 
 <file path=word/document.xml><?xml version="1.0" encoding="utf-8"?>
-<w:document xmlns:wpc="http://schemas.microsoft.com/office/word/2010/wordprocessingCanvas" xmlns:cx="http://schemas.microsoft.com/office/drawing/2014/chartex" xmlns:cx1="http://schemas.microsoft.com/office/drawing/2015/9/8/chartex" xmlns:cx2="http://schemas.microsoft.com/office/drawing/2015/10/21/chartex" xmlns:cx3="http://schemas.microsoft.com/office/drawing/2016/5/9/chartex" xmlns:cx4="http://schemas.microsoft.com/office/drawing/2016/5/10/chartex" xmlns:cx5="http://schemas.microsoft.com/office/drawing/2016/5/11/chartex" xmlns:cx6="http://schemas.microsoft.com/office/drawing/2016/5/12/chartex" xmlns:cx7="http://schemas.microsoft.com/office/drawing/2016/5/13/chartex" xmlns:cx8="http://schemas.microsoft.com/office/drawing/2016/5/14/chartex" xmlns:mc="http://schemas.openxmlformats.org/markup-compatibility/2006" xmlns:m="http://schemas.openxmlformats.org/officeDocument/2006/math" xmlns:aink="http://schemas.microsoft.com/office/drawing/2016/ink" xmlns:am3d="http://schemas.microsoft.com/office/drawing/2017/model3d" xmlns:oel="http://schemas.microsoft.com/office/2019/extlst" xmlns:r="http://schemas.openxmlformats.org/officeDocument/2006/relationships" xmlns:wp14="http://schemas.microsoft.com/office/word/2010/wordprocessingDrawing" xmlns:wp="http://schemas.openxmlformats.org/drawingml/2006/wordprocessingDrawing" xmlns:wpg="http://schemas.microsoft.com/office/word/2010/wordprocessingGroup" xmlns:wpi="http://schemas.microsoft.com/office/word/2010/wordprocessingInk" xmlns:wps="http://schemas.microsoft.com/office/word/2010/wordprocessingShape" xmlns:o="urn:schemas-microsoft-com:office:office" xmlns:v="urn:schemas-microsoft-com:vml" xmlns:w10="urn:schemas-microsoft-com:office:word" xmlns:w="http://schemas.openxmlformats.org/wordprocessingml/2006/main" xmlns:w14="http://schemas.microsoft.com/office/word/2010/wordml" xmlns:w15="http://schemas.microsoft.com/office/word/2012/wordml" xmlns:w16cex="http://schemas.microsoft.com/office/word/2018/wordml/cex" xmlns:w16cid="http://schemas.microsoft.com/office/word/2016/wordml/cid" xmlns:w16="http://schemas.microsoft.com/office/word/2018/wordml" xmlns:w16sdtdh="http://schemas.microsoft.com/office/word/2020/wordml/sdtdatahash" xmlns:w16sdtfl="http://schemas.microsoft.com/office/word/2024/wordml/sdtformatlock" xmlns:w16se="http://schemas.microsoft.com/office/word/2015/wordml/symex" xmlns:w16du="http://schemas.microsoft.com/office/word/2023/wordml/word16du" xmlns:wne="http://schemas.microsoft.com/office/word/2006/wordml" mc:Ignorable="w14 w15 w16se w16cid w16 w16cex w16sdtdh w16sdtfl w16du wp14">
+<w:document xmlns:wpc="http://schemas.microsoft.com/office/word/2010/wordprocessingCanvas" xmlns:cx="http://schemas.microsoft.com/office/drawing/2014/chartex" xmlns:cx1="http://schemas.microsoft.com/office/drawing/2015/9/8/chartex" xmlns:cx2="http://schemas.microsoft.com/office/drawing/2015/10/21/chartex" xmlns:cx3="http://schemas.microsoft.com/office/drawing/2016/5/9/chartex" xmlns:cx4="http://schemas.microsoft.com/office/drawing/2016/5/10/chartex" xmlns:cx5="http://schemas.microsoft.com/office/drawing/2016/5/11/chartex" xmlns:cx6="http://schemas.microsoft.com/office/drawing/2016/5/12/chartex" xmlns:cx7="http://schemas.microsoft.com/office/drawing/2016/5/13/chartex" xmlns:cx8="http://schemas.microsoft.com/office/drawing/2016/5/14/chartex" xmlns:mc="http://schemas.openxmlformats.org/markup-compatibility/2006" xmlns:aink="http://schemas.microsoft.com/office/drawing/2016/ink" xmlns:am3d="http://schemas.microsoft.com/office/drawing/2017/model3d" xmlns:o="urn:schemas-microsoft-com:office:office" xmlns:oel="http://schemas.microsoft.com/office/2019/extlst" xmlns:r="http://schemas.openxmlformats.org/officeDocument/2006/relationships" xmlns:m="http://schemas.openxmlformats.org/officeDocument/2006/math" xmlns:v="urn:schemas-microsoft-com:vml" xmlns:wp14="http://schemas.microsoft.com/office/word/2010/wordprocessingDrawing" xmlns:wp="http://schemas.openxmlformats.org/drawingml/2006/wordprocessingDrawing" xmlns:w10="urn:schemas-microsoft-com:office:word" xmlns:w="http://schemas.openxmlformats.org/wordprocessingml/2006/main" xmlns:w14="http://schemas.microsoft.com/office/word/2010/wordml" xmlns:w15="http://schemas.microsoft.com/office/word/2012/wordml" xmlns:w16cex="http://schemas.microsoft.com/office/word/2018/wordml/cex" xmlns:w16cid="http://schemas.microsoft.com/office/word/2016/wordml/cid" xmlns:w16="http://schemas.microsoft.com/office/word/2018/wordml" xmlns:w16du="http://schemas.microsoft.com/office/word/2023/wordml/word16du" xmlns:w16sdtdh="http://schemas.microsoft.com/office/word/2020/wordml/sdtdatahash" xmlns:w16sdtfl="http://schemas.microsoft.com/office/word/2024/wordml/sdtformatlock" xmlns:w16se="http://schemas.microsoft.com/office/word/2015/wordml/symex" xmlns:wpg="http://schemas.microsoft.com/office/word/2010/wordprocessingGroup" xmlns:wpi="http://schemas.microsoft.com/office/word/2010/wordprocessingInk" xmlns:wne="http://schemas.microsoft.com/office/word/2006/wordml" xmlns:wps="http://schemas.microsoft.com/office/word/2010/wordprocessingShape" mc:Ignorable="w14 w15 w16se w16cid w16 w16cex w16sdtdh w16sdtfl w16du wp14">
   <w:body>
     <w:p>
       <w:pPr>
@@ -21,16 +21,7 @@
           <w:sz w:val="32"/>
           <w:szCs w:val="32"/>
         </w:rPr>
-        <w:t>Manuscript</w:t>
-      </w:r>
-      <w:r>
-        <w:rPr>
-          <w:b/>
-          <w:bCs/>
-          <w:sz w:val="32"/>
-          <w:szCs w:val="32"/>
-        </w:rPr>
-        <w:t xml:space="preserve"> Tables</w:t>
+        <w:t>Main Paper Tables</w:t>
       </w:r>
     </w:p>
     <w:p>
@@ -667,7 +658,10 @@
         <w:t>Note.</w:t>
       </w:r>
       <w:r>
-        <w:t xml:space="preserve"> All three databases (PsycINFO, MEDLINE, Web of Science Core Collection) were searched in every round. Round 3 included a Google Scholar sensitivity check. Round 3 search strings are available in Appendix 01.1.</w:t>
+        <w:t xml:space="preserve"> All three databases (PsycINFO, MEDLINE, Web of Science Core Collection) were searched in every round. Round 3 included a Google Scholar sensitivity check. </w:t>
+      </w:r>
+      <w:r>
+        <w:t>Round 3 search strings are available in Appendix 01.1.</w:t>
       </w:r>
     </w:p>
     <w:p>
@@ -4409,7 +4403,13 @@
         <w:t>Note.</w:t>
       </w:r>
       <w:r>
-        <w:t xml:space="preserve"> Cells are tool-record counts (N = 410). Evidence Quality levels (HIGH to LOW) are defined in Appendix 02.5 and Direction of Finding categories in Appendix 02.4. The HIGH tier is retained to preserve the scale ceiling (k = 0).</w:t>
+        <w:t xml:space="preserve"> Cells are tool-record counts (N = 410). </w:t>
+      </w:r>
+      <w:r>
+        <w:t xml:space="preserve">Evidence Quality levels (HIGH to LOW) are defined in Appendix 02.5 and Direction of Finding categories in Appendix 02.4.</w:t>
+      </w:r>
+      <w:r>
+        <w:t xml:space="preserve"> The HIGH tier is retained to preserve the scale ceiling (k = 0).</w:t>
       </w:r>
     </w:p>
     <w:p>
@@ -7153,7 +7153,13 @@
         <w:t>Note.</w:t>
       </w:r>
       <w:r>
-        <w:t xml:space="preserve"> Framework tools are grouped into 15 framework domains by primary mechanism. Evidence Status: ET = Empirically tested, TD = Theoretically derived, PS = Policy or structural, ND = Newly designed, recorded as Extrapolated in the deposited files (all defined in Appendix 04.2). Percentages are of 210 framework tools. The Newly Designed Tools domain comprises 34 Newly designed tools; the two others in that block (T200, T207) carry Empirically tested status and are counted as such.</w:t>
+        <w:t xml:space="preserve"> Framework tools are grouped into 15 framework domains by primary mechanism. Evidence Status: ET = Empirically tested, TD = Theoretically derived, PS = Policy or structural, </w:t>
+      </w:r>
+      <w:r>
+        <w:t>ND = Newly designed, recorded as Extrapolated in the deposited files (all defined in Appendix 04.2)</w:t>
+      </w:r>
+      <w:r>
+        <w:t>. Percentages are of 210 framework tools. The Newly Designed Tools domain comprises 34 Newly designed tools; the two others in that block (T200, T207) carry Empirically tested status and are counted as such. The Newly Designed Tools domain appears as Extrapolated and Novel Tools in the deposited files.</w:t>
       </w:r>
     </w:p>
     <w:p>
@@ -7263,7 +7269,7 @@
                 <w:b/>
                 <w:bCs/>
               </w:rPr>
-              <w:t>Criterion</w:t>
+              <w:t xml:space="preserve">Criterion</w:t>
             </w:r>
           </w:p>
         </w:tc>
@@ -7354,7 +7360,13 @@
               <w:contextualSpacing/>
             </w:pPr>
             <w:r>
-              <w:t>Delivered within an online gambling platform while the gambler gambles or accesses their account.</w:t>
+              <w:t>Delivered within an online gam</w:t>
+            </w:r>
+            <w:r>
+              <w:t>bling platform while the gambler gambles or accesses thei</w:t>
+            </w:r>
+            <w:r>
+              <w:t>r account.</w:t>
             </w:r>
           </w:p>
         </w:tc>
@@ -7441,7 +7453,7 @@
               <w:contextualSpacing/>
             </w:pPr>
             <w:r>
-              <w:t>Operates across online and land-based contexts, typically via registry or cross-platform mechanisms.</w:t>
+              <w:t xml:space="preserve">Operates across online and land-based contexts, typically via registry or cross-platform mechanisms.</w:t>
             </w:r>
           </w:p>
         </w:tc>
@@ -7528,7 +7540,7 @@
               <w:contextualSpacing/>
             </w:pPr>
             <w:r>
-              <w:t>Delivered within a physical venue’s gambling products or systems.</w:t>
+              <w:t xml:space="preserve">Delivered within a physical venue’s gambling products or systems.</w:t>
             </w:r>
           </w:p>
         </w:tc>
@@ -7615,7 +7627,7 @@
               <w:contextualSpacing/>
             </w:pPr>
             <w:r>
-              <w:t>Channel-agnostic; delivered through community-facing channels such as campaigns, materials, or helplines.</w:t>
+              <w:t xml:space="preserve">Channel-agnostic; delivered through community-facing channels such as campaigns, materials, or helplines.</w:t>
             </w:r>
           </w:p>
         </w:tc>
@@ -7702,7 +7714,10 @@
               <w:contextualSpacing/>
             </w:pPr>
             <w:r>
-              <w:t>Channel-agnostic; the gambler implements the tool without operator or clinician infrastructure.</w:t>
+              <w:t>Channel-agnostic; the gambler implements the tool with</w:t>
+            </w:r>
+            <w:r>
+              <w:t>out operator or clinician infrastructure.</w:t>
             </w:r>
           </w:p>
         </w:tc>
@@ -7789,7 +7804,7 @@
               <w:contextualSpacing/>
             </w:pPr>
             <w:r>
-              <w:t>Channel-agnostic; delivered through clinical or treatment contexts such as therapy or counselling.</w:t>
+              <w:t xml:space="preserve">Channel-agnostic; delivered through clinical or treatment contexts such as therapy or counselling.</w:t>
             </w:r>
           </w:p>
         </w:tc>
@@ -7874,7 +7889,7 @@
               <w:contextualSpacing/>
             </w:pPr>
             <w:r>
-              <w:t>Residual delivery contexts with fewer than five framework tools each.</w:t>
+              <w:t xml:space="preserve">Residual delivery contexts with fewer than five framework tools each.</w:t>
             </w:r>
           </w:p>
         </w:tc>
@@ -8097,7 +8112,7 @@
                 <w:b/>
                 <w:bCs/>
               </w:rPr>
-              <w:t>Criterion</w:t>
+              <w:t xml:space="preserve">Criterion</w:t>
             </w:r>
           </w:p>
         </w:tc>
@@ -8275,7 +8290,10 @@
               <w:contextualSpacing/>
             </w:pPr>
             <w:r>
-              <w:t>Cannot be declined by the gambler.</w:t>
+              <w:t>C</w:t>
+            </w:r>
+            <w:r>
+              <w:t>annot be declined by the gambler.</w:t>
             </w:r>
           </w:p>
         </w:tc>
@@ -8362,7 +8380,13 @@
               <w:contextualSpacing/>
             </w:pPr>
             <w:r>
-              <w:t>Applied independently by the gambler without operator infrastructure.</w:t>
+              <w:t>Appl</w:t>
+            </w:r>
+            <w:r>
+              <w:t>ied independently by the gambler without operator infrast</w:t>
+            </w:r>
+            <w:r>
+              <w:t>ructure.</w:t>
             </w:r>
           </w:p>
         </w:tc>
@@ -8449,7 +8473,10 @@
               <w:contextualSpacing/>
             </w:pPr>
             <w:r>
-              <w:t>Operates entirely behind the scenes without gambler-facing controls.</w:t>
+              <w:t>Operates entirely b</w:t>
+            </w:r>
+            <w:r>
+              <w:t>ehind the scenes without gambler-facing controls.</w:t>
             </w:r>
           </w:p>
         </w:tc>
@@ -8519,7 +8546,6 @@
                 <w:sz w:val="20"/>
                 <w:szCs w:val="20"/>
               </w:rPr>
-              <w:lastRenderedPageBreak/>
               <w:t>Voluntary (opt-out)</w:t>
             </w:r>
           </w:p>
@@ -8537,7 +8563,10 @@
               <w:contextualSpacing/>
             </w:pPr>
             <w:r>
-              <w:t>Enabled by default; requires gambler choice to disable.</w:t>
+              <w:t>Enab</w:t>
+            </w:r>
+            <w:r>
+              <w:t>led by default; requires gambler choice to disable.</w:t>
             </w:r>
           </w:p>
         </w:tc>
@@ -8624,7 +8653,10 @@
               <w:contextualSpacing/>
             </w:pPr>
             <w:r>
-              <w:t>Combines gambler-side choice with operator-side enforcement.</w:t>
+              <w:t>Combines gambler-side choice with operato</w:t>
+            </w:r>
+            <w:r>
+              <w:t>r-side enforcement.</w:t>
             </w:r>
           </w:p>
         </w:tc>
@@ -8847,7 +8879,7 @@
                 <w:b/>
                 <w:bCs/>
               </w:rPr>
-              <w:t>Criterion</w:t>
+              <w:t xml:space="preserve">Criterion</w:t>
             </w:r>
           </w:p>
         </w:tc>
@@ -8938,7 +8970,10 @@
               <w:contextualSpacing/>
             </w:pPr>
             <w:r>
-              <w:t>Identical content or parameters for all gamblers who receive the tool.</w:t>
+              <w:t>Identical conte</w:t>
+            </w:r>
+            <w:r>
+              <w:t>nt or parameters for all gamblers who receive the tool.</w:t>
             </w:r>
           </w:p>
         </w:tc>
@@ -9025,7 +9060,10 @@
               <w:contextualSpacing/>
             </w:pPr>
             <w:r>
-              <w:t>Content or parameters tailored algorithmically from observed gambler data.</w:t>
+              <w:t>Content or parameters tailored algor</w:t>
+            </w:r>
+            <w:r>
+              <w:t>ithmically from observed gambler data.</w:t>
             </w:r>
           </w:p>
         </w:tc>
@@ -9112,7 +9150,10 @@
               <w:contextualSpacing/>
             </w:pPr>
             <w:r>
-              <w:t>The gambler sets their own parameters or selects from options.</w:t>
+              <w:t>The gambler sets their own parameter</w:t>
+            </w:r>
+            <w:r>
+              <w:t>s or selects from options.</w:t>
             </w:r>
           </w:p>
         </w:tc>
@@ -9199,7 +9240,10 @@
               <w:contextualSpacing/>
             </w:pPr>
             <w:r>
-              <w:t>The gambler sets a goal or parameter; the system tailors delivery.</w:t>
+              <w:t>The gambler sets a goal or parameter</w:t>
+            </w:r>
+            <w:r>
+              <w:t>; the system tailors delivery.</w:t>
             </w:r>
           </w:p>
         </w:tc>
@@ -9286,7 +9330,7 @@
               <w:contextualSpacing/>
             </w:pPr>
             <w:r>
-              <w:t>A clinician, advisor, or trained staff member adapts the tool by judgement-based assessment.</w:t>
+              <w:t xml:space="preserve">A clinician, advisor, or trained staff member adapts the tool by judgement-based assessment.</w:t>
             </w:r>
           </w:p>
         </w:tc>
@@ -9371,7 +9415,7 @@
               <w:contextualSpacing/>
             </w:pPr>
             <w:r>
-              <w:t>Residual combinations of personalisation modes with fewer than three framework tools each.</w:t>
+              <w:t xml:space="preserve">Residual combinations of personalisation modes with fewer than three framework tools each.</w:t>
             </w:r>
           </w:p>
         </w:tc>
@@ -9594,7 +9638,7 @@
                 <w:b/>
                 <w:bCs/>
               </w:rPr>
-              <w:t>Criterion</w:t>
+              <w:t xml:space="preserve">Criterion</w:t>
             </w:r>
           </w:p>
         </w:tc>
@@ -9685,7 +9729,10 @@
               <w:contextualSpacing/>
             </w:pPr>
             <w:r>
-              <w:t>Available whenever the gambler seeks it, at their point of access.</w:t>
+              <w:t>Available whenever the gambler seeks it, at their point</w:t>
+            </w:r>
+            <w:r>
+              <w:t xml:space="preserve"> of access.</w:t>
             </w:r>
           </w:p>
         </w:tc>
@@ -9772,7 +9819,10 @@
               <w:contextualSpacing/>
             </w:pPr>
             <w:r>
-              <w:t>Operates while the gambler is actively gambling within a session.</w:t>
+              <w:t>Operates while the gambler is actively gambling wit</w:t>
+            </w:r>
+            <w:r>
+              <w:t>hin a session.</w:t>
             </w:r>
           </w:p>
         </w:tc>
@@ -9859,7 +9909,7 @@
               <w:contextualSpacing/>
             </w:pPr>
             <w:r>
-              <w:t>Operates at all times, independent of session boundaries.</w:t>
+              <w:t xml:space="preserve">Operates at all times, independent of session boundaries.</w:t>
             </w:r>
           </w:p>
         </w:tc>
@@ -9946,7 +9996,7 @@
               <w:contextualSpacing/>
             </w:pPr>
             <w:r>
-              <w:t>Operates between gambling sessions, at account level rather than in play.</w:t>
+              <w:t xml:space="preserve">Operates between gambling sessions, at account level rather than in play.</w:t>
             </w:r>
           </w:p>
         </w:tc>
@@ -10033,7 +10083,7 @@
               <w:contextualSpacing/>
             </w:pPr>
             <w:r>
-              <w:t>Operates before a gambling session begins.</w:t>
+              <w:t xml:space="preserve">Operates before a gambling session begins.</w:t>
             </w:r>
           </w:p>
         </w:tc>
@@ -10103,7 +10153,6 @@
                 <w:sz w:val="20"/>
                 <w:szCs w:val="20"/>
               </w:rPr>
-              <w:lastRenderedPageBreak/>
               <w:t>Post-session</w:t>
             </w:r>
           </w:p>
@@ -10121,7 +10170,7 @@
               <w:contextualSpacing/>
             </w:pPr>
             <w:r>
-              <w:t>Operates after a gambling session ends.</w:t>
+              <w:t xml:space="preserve">Operates after a gambling session ends.</w:t>
             </w:r>
           </w:p>
         </w:tc>
@@ -10206,7 +10255,7 @@
               <w:contextualSpacing/>
             </w:pPr>
             <w:r>
-              <w:t>Residual activation stages grouped for reporting.</w:t>
+              <w:t xml:space="preserve">Residual activation stages grouped for reporting.</w:t>
             </w:r>
           </w:p>
         </w:tc>
@@ -10364,10 +10413,17 @@
           <w:i/>
           <w:iCs/>
         </w:rPr>
+        <w:lastRenderedPageBreak/>
         <w:t>Note.</w:t>
       </w:r>
       <w:r>
-        <w:t xml:space="preserve"> Delivery Context categories with &lt; 5 framework tools are grouped as ‘Other’. Personalisation modes with &lt; 3 framework tools are grouped as ‘Other’. Full definitions and exemplar tools for every value are in Appendix 04.2. </w:t>
+        <w:t xml:space="preserve"> Delivery Context categories with &lt; 5 framework tools are grouped as ‘Other’. Personalisation modes with &lt; 3 framework tools are grouped as ‘Other’.</w:t>
+      </w:r>
+      <w:r>
+        <w:t xml:space="preserve"> Full definitions of every value are in Appendix 04.2.</w:t>
+      </w:r>
+      <w:r>
+        <w:t xml:space="preserve"> </w:t>
       </w:r>
     </w:p>
     <w:p>
@@ -11677,7 +11733,13 @@
         <w:t>Note.</w:t>
       </w:r>
       <w:r>
-        <w:t xml:space="preserve"> Cells are framework tool counts. Evidence Status categories (ET, TD, PS, ND) are defined in Table 4. Only 5 of 143 Empirically tested framework tools target Moderate-risk populations specifically; three of the 10 Moderate-risk tools are Newly designed. This concentration on Universal targeting at the Empirically tested tier reflects the prevention-paradox pattern documented in Appendix 03.3. Counts record the population a tool was designed for, not the population it reaches. Universal tools are available to moderate-risk gamblers.</w:t>
+        <w:t xml:space="preserve"> Cells are framework tool counts. Evidence Status categories (ET, TD, PS, ND) are defined in Table 4. Only 5 of 143 Empirically tested framework tools target Moderate-risk populations specifically; </w:t>
+      </w:r>
+      <w:r>
+        <w:t>three of the 10 Moderate-risk tools are Newly designed. This concentration on Universal targeting at the Empirically tested tier reflects the prevention-paradox pattern documented in Appendix 03.3.</w:t>
+      </w:r>
+      <w:r>
+        <w:t xml:space="preserve"> Counts record the population a tool was designed for, not the population it reaches. Universal tools are available to moderate-risk gamblers.</w:t>
       </w:r>
     </w:p>
     <w:p>
@@ -13335,7 +13397,13 @@
         <w:t>Note.</w:t>
       </w:r>
       <w:r>
-        <w:t xml:space="preserve"> Cells are deployed tool-variant counts; 0 = tool not deployed in that architecture (UK excludes Automatic Withdrawal Limit on technical grounds; NL excludes Bonus Ban and Promo Ban on regulatory grounds). Risk tiers: R1 (low), R2 (moderate), R3 (high); the young-adult overlay applies independently of risk tier (UK uses age-band sub-tiers for Loss Limit). Percentages are of each architecture’s total tool variants (94 UK, 87 NL). Full specifications are in Appendix 05.1/05.2.</w:t>
+        <w:t xml:space="preserve"> Cells are deployed tool-variant counts; </w:t>
+      </w:r>
+      <w:r>
+        <w:t>0 = tool not deployed in that architecture</w:t>
+      </w:r>
+      <w:r>
+        <w:t xml:space="preserve"> (UK excludes Automatic Withdrawal Limit on technical grounds; NL excludes Bonus Ban and Promo Ban on regulatory grounds). Risk tiers: R1 (low), R2 (moderate), R3 (high); the young-adult overlay applies independently of risk tier (UK uses age-band sub-tiers for Loss Limit). Percentages are of each architecture’s total tool variants (94 UK, 87 NL). Full specifications are in Appendix 05.1/05.2.</w:t>
       </w:r>
     </w:p>
     <w:sectPr>
@@ -13351,7 +13419,7 @@
 </file>
 
 <file path=word/endnotes.xml><?xml version="1.0" encoding="utf-8"?>
-<w:endnotes xmlns:wpc="http://schemas.microsoft.com/office/word/2010/wordprocessingCanvas" xmlns:cx="http://schemas.microsoft.com/office/drawing/2014/chartex" xmlns:cx1="http://schemas.microsoft.com/office/drawing/2015/9/8/chartex" xmlns:cx2="http://schemas.microsoft.com/office/drawing/2015/10/21/chartex" xmlns:cx3="http://schemas.microsoft.com/office/drawing/2016/5/9/chartex" xmlns:cx4="http://schemas.microsoft.com/office/drawing/2016/5/10/chartex" xmlns:cx5="http://schemas.microsoft.com/office/drawing/2016/5/11/chartex" xmlns:cx6="http://schemas.microsoft.com/office/drawing/2016/5/12/chartex" xmlns:cx7="http://schemas.microsoft.com/office/drawing/2016/5/13/chartex" xmlns:cx8="http://schemas.microsoft.com/office/drawing/2016/5/14/chartex" xmlns:mc="http://schemas.openxmlformats.org/markup-compatibility/2006" xmlns:m="http://schemas.openxmlformats.org/officeDocument/2006/math" xmlns:aink="http://schemas.microsoft.com/office/drawing/2016/ink" xmlns:am3d="http://schemas.microsoft.com/office/drawing/2017/model3d" xmlns:oel="http://schemas.microsoft.com/office/2019/extlst" xmlns:r="http://schemas.openxmlformats.org/officeDocument/2006/relationships" xmlns:wp14="http://schemas.microsoft.com/office/word/2010/wordprocessingDrawing" xmlns:wp="http://schemas.openxmlformats.org/drawingml/2006/wordprocessingDrawing" xmlns:wpg="http://schemas.microsoft.com/office/word/2010/wordprocessingGroup" xmlns:wpi="http://schemas.microsoft.com/office/word/2010/wordprocessingInk" xmlns:wps="http://schemas.microsoft.com/office/word/2010/wordprocessingShape" xmlns:o="urn:schemas-microsoft-com:office:office" xmlns:v="urn:schemas-microsoft-com:vml" xmlns:w10="urn:schemas-microsoft-com:office:word" xmlns:w="http://schemas.openxmlformats.org/wordprocessingml/2006/main" xmlns:w14="http://schemas.microsoft.com/office/word/2010/wordml" xmlns:w15="http://schemas.microsoft.com/office/word/2012/wordml" xmlns:w16cex="http://schemas.microsoft.com/office/word/2018/wordml/cex" xmlns:w16cid="http://schemas.microsoft.com/office/word/2016/wordml/cid" xmlns:w16="http://schemas.microsoft.com/office/word/2018/wordml" xmlns:w16sdtdh="http://schemas.microsoft.com/office/word/2020/wordml/sdtdatahash" xmlns:w16sdtfl="http://schemas.microsoft.com/office/word/2024/wordml/sdtformatlock" xmlns:w16se="http://schemas.microsoft.com/office/word/2015/wordml/symex" xmlns:w16du="http://schemas.microsoft.com/office/word/2023/wordml/word16du" xmlns:wne="http://schemas.microsoft.com/office/word/2006/wordml" mc:Ignorable="w14 w15 w16se w16cid w16 w16cex w16sdtdh w16sdtfl w16du wp14">
+<w:endnotes xmlns:wpc="http://schemas.microsoft.com/office/word/2010/wordprocessingCanvas" xmlns:cx="http://schemas.microsoft.com/office/drawing/2014/chartex" xmlns:cx1="http://schemas.microsoft.com/office/drawing/2015/9/8/chartex" xmlns:cx2="http://schemas.microsoft.com/office/drawing/2015/10/21/chartex" xmlns:cx3="http://schemas.microsoft.com/office/drawing/2016/5/9/chartex" xmlns:cx4="http://schemas.microsoft.com/office/drawing/2016/5/10/chartex" xmlns:cx5="http://schemas.microsoft.com/office/drawing/2016/5/11/chartex" xmlns:cx6="http://schemas.microsoft.com/office/drawing/2016/5/12/chartex" xmlns:cx7="http://schemas.microsoft.com/office/drawing/2016/5/13/chartex" xmlns:cx8="http://schemas.microsoft.com/office/drawing/2016/5/14/chartex" xmlns:mc="http://schemas.openxmlformats.org/markup-compatibility/2006" xmlns:aink="http://schemas.microsoft.com/office/drawing/2016/ink" xmlns:am3d="http://schemas.microsoft.com/office/drawing/2017/model3d" xmlns:o="urn:schemas-microsoft-com:office:office" xmlns:oel="http://schemas.microsoft.com/office/2019/extlst" xmlns:r="http://schemas.openxmlformats.org/officeDocument/2006/relationships" xmlns:m="http://schemas.openxmlformats.org/officeDocument/2006/math" xmlns:v="urn:schemas-microsoft-com:vml" xmlns:wp14="http://schemas.microsoft.com/office/word/2010/wordprocessingDrawing" xmlns:wp="http://schemas.openxmlformats.org/drawingml/2006/wordprocessingDrawing" xmlns:w10="urn:schemas-microsoft-com:office:word" xmlns:w="http://schemas.openxmlformats.org/wordprocessingml/2006/main" xmlns:w14="http://schemas.microsoft.com/office/word/2010/wordml" xmlns:w15="http://schemas.microsoft.com/office/word/2012/wordml" xmlns:w16cex="http://schemas.microsoft.com/office/word/2018/wordml/cex" xmlns:w16cid="http://schemas.microsoft.com/office/word/2016/wordml/cid" xmlns:w16="http://schemas.microsoft.com/office/word/2018/wordml" xmlns:w16du="http://schemas.microsoft.com/office/word/2023/wordml/word16du" xmlns:w16sdtdh="http://schemas.microsoft.com/office/word/2020/wordml/sdtdatahash" xmlns:w16sdtfl="http://schemas.microsoft.com/office/word/2024/wordml/sdtformatlock" xmlns:w16se="http://schemas.microsoft.com/office/word/2015/wordml/symex" xmlns:wpg="http://schemas.microsoft.com/office/word/2010/wordprocessingGroup" xmlns:wpi="http://schemas.microsoft.com/office/word/2010/wordprocessingInk" xmlns:wne="http://schemas.microsoft.com/office/word/2006/wordml" xmlns:wps="http://schemas.microsoft.com/office/word/2010/wordprocessingShape" mc:Ignorable="w14 w15 w16se w16cid w16 w16cex w16sdtdh w16sdtfl w16du wp14">
   <w:endnote w:type="separator" w:id="-1">
     <w:p>
       <w:r>
@@ -13370,7 +13438,7 @@
 </file>
 
 <file path=word/footer1.xml><?xml version="1.0" encoding="utf-8"?>
-<w:ftr xmlns:wpc="http://schemas.microsoft.com/office/word/2010/wordprocessingCanvas" xmlns:cx="http://schemas.microsoft.com/office/drawing/2014/chartex" xmlns:cx1="http://schemas.microsoft.com/office/drawing/2015/9/8/chartex" xmlns:cx2="http://schemas.microsoft.com/office/drawing/2015/10/21/chartex" xmlns:cx3="http://schemas.microsoft.com/office/drawing/2016/5/9/chartex" xmlns:cx4="http://schemas.microsoft.com/office/drawing/2016/5/10/chartex" xmlns:cx5="http://schemas.microsoft.com/office/drawing/2016/5/11/chartex" xmlns:cx6="http://schemas.microsoft.com/office/drawing/2016/5/12/chartex" xmlns:cx7="http://schemas.microsoft.com/office/drawing/2016/5/13/chartex" xmlns:cx8="http://schemas.microsoft.com/office/drawing/2016/5/14/chartex" xmlns:mc="http://schemas.openxmlformats.org/markup-compatibility/2006" xmlns:m="http://schemas.openxmlformats.org/officeDocument/2006/math" xmlns:aink="http://schemas.microsoft.com/office/drawing/2016/ink" xmlns:am3d="http://schemas.microsoft.com/office/drawing/2017/model3d" xmlns:oel="http://schemas.microsoft.com/office/2019/extlst" xmlns:r="http://schemas.openxmlformats.org/officeDocument/2006/relationships" xmlns:wp14="http://schemas.microsoft.com/office/word/2010/wordprocessingDrawing" xmlns:wp="http://schemas.openxmlformats.org/drawingml/2006/wordprocessingDrawing" xmlns:wpg="http://schemas.microsoft.com/office/word/2010/wordprocessingGroup" xmlns:wpi="http://schemas.microsoft.com/office/word/2010/wordprocessingInk" xmlns:wps="http://schemas.microsoft.com/office/word/2010/wordprocessingShape" xmlns:o="urn:schemas-microsoft-com:office:office" xmlns:v="urn:schemas-microsoft-com:vml" xmlns:w10="urn:schemas-microsoft-com:office:word" xmlns:w="http://schemas.openxmlformats.org/wordprocessingml/2006/main" xmlns:w14="http://schemas.microsoft.com/office/word/2010/wordml" xmlns:w15="http://schemas.microsoft.com/office/word/2012/wordml" xmlns:w16cex="http://schemas.microsoft.com/office/word/2018/wordml/cex" xmlns:w16cid="http://schemas.microsoft.com/office/word/2016/wordml/cid" xmlns:w16="http://schemas.microsoft.com/office/word/2018/wordml" xmlns:w16sdtdh="http://schemas.microsoft.com/office/word/2020/wordml/sdtdatahash" xmlns:w16sdtfl="http://schemas.microsoft.com/office/word/2024/wordml/sdtformatlock" xmlns:w16se="http://schemas.microsoft.com/office/word/2015/wordml/symex" xmlns:w16du="http://schemas.microsoft.com/office/word/2023/wordml/word16du" xmlns:wne="http://schemas.microsoft.com/office/word/2006/wordml" mc:Ignorable="w14 w15 w16se w16cid w16 w16cex w16sdtdh w16sdtfl w16du wp14">
+<w:ftr xmlns:wpc="http://schemas.microsoft.com/office/word/2010/wordprocessingCanvas" xmlns:cx="http://schemas.microsoft.com/office/drawing/2014/chartex" xmlns:cx1="http://schemas.microsoft.com/office/drawing/2015/9/8/chartex" xmlns:cx2="http://schemas.microsoft.com/office/drawing/2015/10/21/chartex" xmlns:cx3="http://schemas.microsoft.com/office/drawing/2016/5/9/chartex" xmlns:cx4="http://schemas.microsoft.com/office/drawing/2016/5/10/chartex" xmlns:cx5="http://schemas.microsoft.com/office/drawing/2016/5/11/chartex" xmlns:cx6="http://schemas.microsoft.com/office/drawing/2016/5/12/chartex" xmlns:cx7="http://schemas.microsoft.com/office/drawing/2016/5/13/chartex" xmlns:cx8="http://schemas.microsoft.com/office/drawing/2016/5/14/chartex" xmlns:mc="http://schemas.openxmlformats.org/markup-compatibility/2006" xmlns:aink="http://schemas.microsoft.com/office/drawing/2016/ink" xmlns:am3d="http://schemas.microsoft.com/office/drawing/2017/model3d" xmlns:o="urn:schemas-microsoft-com:office:office" xmlns:oel="http://schemas.microsoft.com/office/2019/extlst" xmlns:r="http://schemas.openxmlformats.org/officeDocument/2006/relationships" xmlns:m="http://schemas.openxmlformats.org/officeDocument/2006/math" xmlns:v="urn:schemas-microsoft-com:vml" xmlns:wp14="http://schemas.microsoft.com/office/word/2010/wordprocessingDrawing" xmlns:wp="http://schemas.openxmlformats.org/drawingml/2006/wordprocessingDrawing" xmlns:w10="urn:schemas-microsoft-com:office:word" xmlns:w="http://schemas.openxmlformats.org/wordprocessingml/2006/main" xmlns:w14="http://schemas.microsoft.com/office/word/2010/wordml" xmlns:w15="http://schemas.microsoft.com/office/word/2012/wordml" xmlns:w16cex="http://schemas.microsoft.com/office/word/2018/wordml/cex" xmlns:w16cid="http://schemas.microsoft.com/office/word/2016/wordml/cid" xmlns:w16="http://schemas.microsoft.com/office/word/2018/wordml" xmlns:w16du="http://schemas.microsoft.com/office/word/2023/wordml/word16du" xmlns:w16sdtdh="http://schemas.microsoft.com/office/word/2020/wordml/sdtdatahash" xmlns:w16sdtfl="http://schemas.microsoft.com/office/word/2024/wordml/sdtformatlock" xmlns:w16se="http://schemas.microsoft.com/office/word/2015/wordml/symex" xmlns:wpg="http://schemas.microsoft.com/office/word/2010/wordprocessingGroup" xmlns:wpi="http://schemas.microsoft.com/office/word/2010/wordprocessingInk" xmlns:wne="http://schemas.microsoft.com/office/word/2006/wordml" xmlns:wps="http://schemas.microsoft.com/office/word/2010/wordprocessingShape" mc:Ignorable="w14 w15 w16se w16cid w16 w16cex w16sdtdh w16sdtfl w16du wp14">
   <w:p>
     <w:pPr>
       <w:jc w:val="center"/>
@@ -13395,7 +13463,7 @@
 </file>
 
 <file path=word/footnotes.xml><?xml version="1.0" encoding="utf-8"?>
-<w:footnotes xmlns:wpc="http://schemas.microsoft.com/office/word/2010/wordprocessingCanvas" xmlns:cx="http://schemas.microsoft.com/office/drawing/2014/chartex" xmlns:cx1="http://schemas.microsoft.com/office/drawing/2015/9/8/chartex" xmlns:cx2="http://schemas.microsoft.com/office/drawing/2015/10/21/chartex" xmlns:cx3="http://schemas.microsoft.com/office/drawing/2016/5/9/chartex" xmlns:cx4="http://schemas.microsoft.com/office/drawing/2016/5/10/chartex" xmlns:cx5="http://schemas.microsoft.com/office/drawing/2016/5/11/chartex" xmlns:cx6="http://schemas.microsoft.com/office/drawing/2016/5/12/chartex" xmlns:cx7="http://schemas.microsoft.com/office/drawing/2016/5/13/chartex" xmlns:cx8="http://schemas.microsoft.com/office/drawing/2016/5/14/chartex" xmlns:mc="http://schemas.openxmlformats.org/markup-compatibility/2006" xmlns:m="http://schemas.openxmlformats.org/officeDocument/2006/math" xmlns:aink="http://schemas.microsoft.com/office/drawing/2016/ink" xmlns:am3d="http://schemas.microsoft.com/office/drawing/2017/model3d" xmlns:oel="http://schemas.microsoft.com/office/2019/extlst" xmlns:r="http://schemas.openxmlformats.org/officeDocument/2006/relationships" xmlns:wp14="http://schemas.microsoft.com/office/word/2010/wordprocessingDrawing" xmlns:wp="http://schemas.openxmlformats.org/drawingml/2006/wordprocessingDrawing" xmlns:wpg="http://schemas.microsoft.com/office/word/2010/wordprocessingGroup" xmlns:wpi="http://schemas.microsoft.com/office/word/2010/wordprocessingInk" xmlns:wps="http://schemas.microsoft.com/office/word/2010/wordprocessingShape" xmlns:o="urn:schemas-microsoft-com:office:office" xmlns:v="urn:schemas-microsoft-com:vml" xmlns:w10="urn:schemas-microsoft-com:office:word" xmlns:w="http://schemas.openxmlformats.org/wordprocessingml/2006/main" xmlns:w14="http://schemas.microsoft.com/office/word/2010/wordml" xmlns:w15="http://schemas.microsoft.com/office/word/2012/wordml" xmlns:w16cex="http://schemas.microsoft.com/office/word/2018/wordml/cex" xmlns:w16cid="http://schemas.microsoft.com/office/word/2016/wordml/cid" xmlns:w16="http://schemas.microsoft.com/office/word/2018/wordml" xmlns:w16sdtdh="http://schemas.microsoft.com/office/word/2020/wordml/sdtdatahash" xmlns:w16sdtfl="http://schemas.microsoft.com/office/word/2024/wordml/sdtformatlock" xmlns:w16se="http://schemas.microsoft.com/office/word/2015/wordml/symex" xmlns:w16du="http://schemas.microsoft.com/office/word/2023/wordml/word16du" xmlns:wne="http://schemas.microsoft.com/office/word/2006/wordml" mc:Ignorable="w14 w15 w16se w16cid w16 w16cex w16sdtdh w16sdtfl w16du wp14">
+<w:footnotes xmlns:wpc="http://schemas.microsoft.com/office/word/2010/wordprocessingCanvas" xmlns:cx="http://schemas.microsoft.com/office/drawing/2014/chartex" xmlns:cx1="http://schemas.microsoft.com/office/drawing/2015/9/8/chartex" xmlns:cx2="http://schemas.microsoft.com/office/drawing/2015/10/21/chartex" xmlns:cx3="http://schemas.microsoft.com/office/drawing/2016/5/9/chartex" xmlns:cx4="http://schemas.microsoft.com/office/drawing/2016/5/10/chartex" xmlns:cx5="http://schemas.microsoft.com/office/drawing/2016/5/11/chartex" xmlns:cx6="http://schemas.microsoft.com/office/drawing/2016/5/12/chartex" xmlns:cx7="http://schemas.microsoft.com/office/drawing/2016/5/13/chartex" xmlns:cx8="http://schemas.microsoft.com/office/drawing/2016/5/14/chartex" xmlns:mc="http://schemas.openxmlformats.org/markup-compatibility/2006" xmlns:aink="http://schemas.microsoft.com/office/drawing/2016/ink" xmlns:am3d="http://schemas.microsoft.com/office/drawing/2017/model3d" xmlns:o="urn:schemas-microsoft-com:office:office" xmlns:oel="http://schemas.microsoft.com/office/2019/extlst" xmlns:r="http://schemas.openxmlformats.org/officeDocument/2006/relationships" xmlns:m="http://schemas.openxmlformats.org/officeDocument/2006/math" xmlns:v="urn:schemas-microsoft-com:vml" xmlns:wp14="http://schemas.microsoft.com/office/word/2010/wordprocessingDrawing" xmlns:wp="http://schemas.openxmlformats.org/drawingml/2006/wordprocessingDrawing" xmlns:w10="urn:schemas-microsoft-com:office:word" xmlns:w="http://schemas.openxmlformats.org/wordprocessingml/2006/main" xmlns:w14="http://schemas.microsoft.com/office/word/2010/wordml" xmlns:w15="http://schemas.microsoft.com/office/word/2012/wordml" xmlns:w16cex="http://schemas.microsoft.com/office/word/2018/wordml/cex" xmlns:w16cid="http://schemas.microsoft.com/office/word/2016/wordml/cid" xmlns:w16="http://schemas.microsoft.com/office/word/2018/wordml" xmlns:w16du="http://schemas.microsoft.com/office/word/2023/wordml/word16du" xmlns:w16sdtdh="http://schemas.microsoft.com/office/word/2020/wordml/sdtdatahash" xmlns:w16sdtfl="http://schemas.microsoft.com/office/word/2024/wordml/sdtformatlock" xmlns:w16se="http://schemas.microsoft.com/office/word/2015/wordml/symex" xmlns:wpg="http://schemas.microsoft.com/office/word/2010/wordprocessingGroup" xmlns:wpi="http://schemas.microsoft.com/office/word/2010/wordprocessingInk" xmlns:wne="http://schemas.microsoft.com/office/word/2006/wordml" xmlns:wps="http://schemas.microsoft.com/office/word/2010/wordprocessingShape" mc:Ignorable="w14 w15 w16se w16cid w16 w16cex w16sdtdh w16sdtfl w16du wp14">
   <w:footnote w:type="separator" w:id="-1">
     <w:p>
       <w:r>
@@ -13414,7 +13482,7 @@
 </file>
 
 <file path=word/styles.xml><?xml version="1.0" encoding="utf-8"?>
-<w:styles xmlns:mc="http://schemas.openxmlformats.org/markup-compatibility/2006" xmlns:r="http://schemas.openxmlformats.org/officeDocument/2006/relationships" xmlns:w="http://schemas.openxmlformats.org/wordprocessingml/2006/main" xmlns:w14="http://schemas.microsoft.com/office/word/2010/wordml" xmlns:w15="http://schemas.microsoft.com/office/word/2012/wordml" xmlns:w16cex="http://schemas.microsoft.com/office/word/2018/wordml/cex" xmlns:w16cid="http://schemas.microsoft.com/office/word/2016/wordml/cid" xmlns:w16="http://schemas.microsoft.com/office/word/2018/wordml" xmlns:w16sdtdh="http://schemas.microsoft.com/office/word/2020/wordml/sdtdatahash" xmlns:w16sdtfl="http://schemas.microsoft.com/office/word/2024/wordml/sdtformatlock" xmlns:w16se="http://schemas.microsoft.com/office/word/2015/wordml/symex" xmlns:w16du="http://schemas.microsoft.com/office/word/2023/wordml/word16du" mc:Ignorable="w14 w15 w16se w16cid w16 w16cex w16sdtdh w16sdtfl w16du">
+<w:styles xmlns:mc="http://schemas.openxmlformats.org/markup-compatibility/2006" xmlns:r="http://schemas.openxmlformats.org/officeDocument/2006/relationships" xmlns:w="http://schemas.openxmlformats.org/wordprocessingml/2006/main" xmlns:w14="http://schemas.microsoft.com/office/word/2010/wordml" xmlns:w15="http://schemas.microsoft.com/office/word/2012/wordml" xmlns:w16cex="http://schemas.microsoft.com/office/word/2018/wordml/cex" xmlns:w16cid="http://schemas.microsoft.com/office/word/2016/wordml/cid" xmlns:w16="http://schemas.microsoft.com/office/word/2018/wordml" xmlns:w16du="http://schemas.microsoft.com/office/word/2023/wordml/word16du" xmlns:w16sdtdh="http://schemas.microsoft.com/office/word/2020/wordml/sdtdatahash" xmlns:w16sdtfl="http://schemas.microsoft.com/office/word/2024/wordml/sdtformatlock" xmlns:w16se="http://schemas.microsoft.com/office/word/2015/wordml/symex" mc:Ignorable="w14 w15 w16se w16cid w16 w16cex w16sdtdh w16sdtfl w16du">
   <w:docDefaults>
     <w:rPrDefault>
       <w:rPr>
@@ -14340,6 +14408,21 @@
 </file>
 
 <file path=customXml/item1.xml><?xml version="1.0" encoding="utf-8"?>
+<?mso-contentType ?>
+<FormTemplates xmlns="http://schemas.microsoft.com/sharepoint/v3/contenttype/forms">
+  <Display>DocumentLibraryForm</Display>
+  <Edit>DocumentLibraryForm</Edit>
+  <New>DocumentLibraryForm</New>
+</FormTemplates>
+</file>
+
+<file path=customXml/item2.xml><?xml version="1.0" encoding="utf-8"?>
+<p:properties xmlns:p="http://schemas.microsoft.com/office/2006/metadata/properties" xmlns:xsi="http://www.w3.org/2001/XMLSchema-instance" xmlns:pc="http://schemas.microsoft.com/office/infopath/2007/PartnerControls">
+  <documentManagement/>
+</p:properties>
+</file>
+
+<file path=customXml/item3.xml><?xml version="1.0" encoding="utf-8"?>
 <ct:contentTypeSchema xmlns:ct="http://schemas.microsoft.com/office/2006/metadata/contentType" xmlns:ma="http://schemas.microsoft.com/office/2006/metadata/properties/metaAttributes" ct:_="" ma:_="" ma:contentTypeName="Document" ma:contentTypeID="0x01010083226D44F20CB5448B793B025E80E7D7" ma:contentTypeVersion="5" ma:contentTypeDescription="Create a new document." ma:contentTypeScope="" ma:versionID="a735299430b683319cb0b181dcea0825">
   <xsd:schema xmlns:xsd="http://www.w3.org/2001/XMLSchema" xmlns:xs="http://www.w3.org/2001/XMLSchema" xmlns:p="http://schemas.microsoft.com/office/2006/metadata/properties" xmlns:ns2="165071fd-7006-44cc-8d48-42d3eef529cc" targetNamespace="http://schemas.microsoft.com/office/2006/metadata/properties" ma:root="true" ma:fieldsID="b42bd2f4bcced8df480acf63d37efe55" ns2:_="">
     <xsd:import namespace="165071fd-7006-44cc-8d48-42d3eef529cc"/>
@@ -14477,22 +14560,24 @@
 </ct:contentTypeSchema>
 </file>
 
-<file path=customXml/item2.xml><?xml version="1.0" encoding="utf-8"?>
-<p:properties xmlns:p="http://schemas.microsoft.com/office/2006/metadata/properties" xmlns:xsi="http://www.w3.org/2001/XMLSchema-instance" xmlns:pc="http://schemas.microsoft.com/office/infopath/2007/PartnerControls">
-  <documentManagement/>
-</p:properties>
+<file path=customXml/itemProps1.xml><?xml version="1.0" encoding="utf-8"?>
+<ds:datastoreItem xmlns:ds="http://schemas.openxmlformats.org/officeDocument/2006/customXml" ds:itemID="{4A429ABB-B646-4F09-82E4-47AF69A1DFD1}">
+  <ds:schemaRefs>
+    <ds:schemaRef ds:uri="http://schemas.microsoft.com/sharepoint/v3/contenttype/forms"/>
+  </ds:schemaRefs>
+</ds:datastoreItem>
 </file>
 
-<file path=customXml/item3.xml><?xml version="1.0" encoding="utf-8"?>
-<?mso-contentType ?>
-<FormTemplates xmlns="http://schemas.microsoft.com/sharepoint/v3/contenttype/forms">
-  <Display>DocumentLibraryForm</Display>
-  <Edit>DocumentLibraryForm</Edit>
-  <New>DocumentLibraryForm</New>
-</FormTemplates>
+<file path=customXml/itemProps2.xml><?xml version="1.0" encoding="utf-8"?>
+<ds:datastoreItem xmlns:ds="http://schemas.openxmlformats.org/officeDocument/2006/customXml" ds:itemID="{55EB1855-9547-4FEE-8A07-DD3280DB227F}">
+  <ds:schemaRefs>
+    <ds:schemaRef ds:uri="http://schemas.microsoft.com/office/2006/metadata/properties"/>
+    <ds:schemaRef ds:uri="http://schemas.microsoft.com/office/infopath/2007/PartnerControls"/>
+  </ds:schemaRefs>
+</ds:datastoreItem>
 </file>
 
-<file path=customXml/itemProps1.xml><?xml version="1.0" encoding="utf-8"?>
+<file path=customXml/itemProps3.xml><?xml version="1.0" encoding="utf-8"?>
 <ds:datastoreItem xmlns:ds="http://schemas.openxmlformats.org/officeDocument/2006/customXml" ds:itemID="{E9CFC9C3-61FD-40E4-A996-03E72FF02597}">
   <ds:schemaRefs>
     <ds:schemaRef ds:uri="http://schemas.microsoft.com/office/2006/metadata/contentType"/>
@@ -14508,21 +14593,4 @@
     <ds:schemaRef ds:uri="http://schemas.microsoft.com/internal/obd"/>
   </ds:schemaRefs>
 </ds:datastoreItem>
-</file>
-
-<file path=customXml/itemProps2.xml><?xml version="1.0" encoding="utf-8"?>
-<ds:datastoreItem xmlns:ds="http://schemas.openxmlformats.org/officeDocument/2006/customXml" ds:itemID="{55EB1855-9547-4FEE-8A07-DD3280DB227F}">
-  <ds:schemaRefs>
-    <ds:schemaRef ds:uri="http://schemas.microsoft.com/office/2006/metadata/properties"/>
-    <ds:schemaRef ds:uri="http://schemas.microsoft.com/office/infopath/2007/PartnerControls"/>
-  </ds:schemaRefs>
-</ds:datastoreItem>
-</file>
-
-<file path=customXml/itemProps3.xml><?xml version="1.0" encoding="utf-8"?>
-<ds:datastoreItem xmlns:ds="http://schemas.openxmlformats.org/officeDocument/2006/customXml" ds:itemID="{4A429ABB-B646-4F09-82E4-47AF69A1DFD1}">
-  <ds:schemaRefs>
-    <ds:schemaRef ds:uri="http://schemas.microsoft.com/sharepoint/v3/contenttype/forms"/>
-  </ds:schemaRefs>
-</ds:datastoreItem>
 </file>
</xml_diff>